<commit_message>
docs: prioritize MVP requirements and align traceability
</commit_message>
<xml_diff>
--- a/docs/entrega-1/acta-constitucion-marketplace.docx
+++ b/docs/entrega-1/acta-constitucion-marketplace.docx
@@ -2427,12 +2427,7 @@
               <w:jc w:val="both"/>
             </w:pPr>
             <w:r>
-              <w:rPr>
-                <w:rFonts w:ascii="Arial" w:hAnsi="Arial" w:cs="Arial"/>
-                <w:sz w:val="21"/>
-                <w:szCs w:val="21"/>
-              </w:rPr>
-              <w:t xml:space="preserve">El MVP debe cubrir los siguientes requerimientos (entre paréntesis la historia de usuario en Jira):</w:t>
+              <w:t>El alcance funcional de Entrega 1 es el siguiente. Las prioridades indican el plan, no implementación actual:</w:t>
             </w:r>
           </w:p>
           <w:p>
@@ -2446,12 +2441,7 @@
               <w:ind w:left="372" w:right="120" w:hanging="252"/>
             </w:pPr>
             <w:r>
-              <w:rPr>
-                <w:rFonts w:ascii="Arial" w:hAnsi="Arial" w:cs="Arial"/>
-                <w:sz w:val="21"/>
-                <w:szCs w:val="21"/>
-              </w:rPr>
-              <w:t xml:space="preserve">Registro e inicio de sesión con los roles HUÉSPED, ANFITRIÓN y ADMINISTRADOR, protección de rutas y recuperación simulada de contraseña (HU-01, HU-02).</w:t>
+              <w:t>MUST — HU-01: registro e inicio de sesión por rol, protección de rutas y permisos.</w:t>
             </w:r>
           </w:p>
           <w:p>
@@ -2465,12 +2455,7 @@
               <w:ind w:left="372" w:right="120" w:hanging="252"/>
             </w:pPr>
             <w:r>
-              <w:rPr>
-                <w:rFonts w:ascii="Arial" w:hAnsi="Arial" w:cs="Arial"/>
-                <w:sz w:val="21"/>
-                <w:szCs w:val="21"/>
-              </w:rPr>
-              <w:t xml:space="preserve">Consultar y actualizar el perfil, y activar o desactivar la cuenta (HU-03).</w:t>
+              <w:t>MUST — HU-04/HU-05: crear y editar publicaciones, datos mínimos, estados y bloqueo administrativo de publicaciones.</w:t>
             </w:r>
           </w:p>
           <w:p>
@@ -2484,12 +2469,7 @@
               <w:ind w:left="372" w:right="120" w:hanging="252"/>
             </w:pPr>
             <w:r>
-              <w:rPr>
-                <w:rFonts w:ascii="Arial" w:hAnsi="Arial" w:cs="Arial"/>
-                <w:sz w:val="21"/>
-                <w:szCs w:val="21"/>
-              </w:rPr>
-              <w:t xml:space="preserve">Crear, editar, activar, pausar y consultar publicaciones con título, descripción, ubicación, tipo, capacidad, precio por noche, servicios, reglas e imágenes (HU-04, HU-05).</w:t>
+              <w:t>MUST — HU-06 a HU-09: disponibilidad, búsqueda, detalle y cotización desglosada.</w:t>
             </w:r>
           </w:p>
           <w:p>
@@ -2503,12 +2483,7 @@
               <w:ind w:left="372" w:right="120" w:hanging="252"/>
             </w:pPr>
             <w:r>
-              <w:rPr>
-                <w:rFonts w:ascii="Arial" w:hAnsi="Arial" w:cs="Arial"/>
-                <w:sz w:val="21"/>
-                <w:szCs w:val="21"/>
-              </w:rPr>
-              <w:t xml:space="preserve">Administrar la disponibilidad del alojamiento y bloquear automáticamente los periodos reservados (HU-06).</w:t>
+              <w:t>MUST — HU-10 a HU-12: reserva idempotente, pago de prueba, historial y cancelación conforme a política.</w:t>
             </w:r>
           </w:p>
           <w:p>
@@ -2522,12 +2497,7 @@
               <w:ind w:left="372" w:right="120" w:hanging="252"/>
             </w:pPr>
             <w:r>
-              <w:rPr>
-                <w:rFonts w:ascii="Arial" w:hAnsi="Arial" w:cs="Arial"/>
-                <w:sz w:val="21"/>
-                <w:szCs w:val="21"/>
-              </w:rPr>
-              <w:t xml:space="preserve">Buscar y filtrar por ciudad, fechas, capacidad, tipo, rango de precio y servicios, y ver el detalle del alojamiento (HU-07, HU-08).</w:t>
+              <w:t>MUST — HU-19: logs estructurados de operaciones críticas y protección de credenciales.</w:t>
             </w:r>
           </w:p>
           <w:p>
@@ -2541,12 +2511,7 @@
               <w:ind w:left="372" w:right="120" w:hanging="252"/>
             </w:pPr>
             <w:r>
-              <w:rPr>
-                <w:rFonts w:ascii="Arial" w:hAnsi="Arial" w:cs="Arial"/>
-                <w:sz w:val="21"/>
-                <w:szCs w:val="21"/>
-              </w:rPr>
-              <w:t xml:space="preserve">Cotización con noches, precio base, limpieza, tarifa de servicio, descuentos, servicios adicionales y total (HU-09).</w:t>
+              <w:t>SHOULD — HU-02, HU-03, HU-13 a HU-17: recuperación y perfil/cuenta, notificaciones, reseñas/moderación, restricción de cuentas/consulta de auditoría y dashboard.</w:t>
             </w:r>
           </w:p>
           <w:p>
@@ -2560,12 +2525,7 @@
               <w:ind w:left="372" w:right="120" w:hanging="252"/>
             </w:pPr>
             <w:r>
-              <w:rPr>
-                <w:rFonts w:ascii="Arial" w:hAnsi="Arial" w:cs="Arial"/>
-                <w:sz w:val="21"/>
-                <w:szCs w:val="21"/>
-              </w:rPr>
-              <w:t xml:space="preserve">Crear una reserva inmediata sin reservas superpuestas y consultar su estado e historial (HU-10, HU-11).</w:t>
+              <w:t>COULD — HU-18: exportación PDF/Excel, si hay capacidad después de completar el MUST.</w:t>
             </w:r>
           </w:p>
           <w:p>
@@ -2579,145 +2539,7 @@
               <w:ind w:left="372" w:right="120" w:hanging="252"/>
             </w:pPr>
             <w:r>
-              <w:rPr>
-                <w:rFonts w:ascii="Arial" w:hAnsi="Arial" w:cs="Arial"/>
-                <w:sz w:val="21"/>
-                <w:szCs w:val="21"/>
-              </w:rPr>
-              <w:t xml:space="preserve">Cancelar una reserva aplicando la política de cancelación de la publicación y liberar el periodo (HU-12).</w:t>
-            </w:r>
-          </w:p>
-          <w:p>
-            <w:pPr>
-              <w:pStyle w:val="TableParagraph"/>
-              <w:numPr>
-                <w:ilvl w:val="0"/>
-                <w:numId w:val="1"/>
-              </w:numPr>
-              <w:spacing w:before="20" w:after="20" w:line="252" w:lineRule="auto"/>
-              <w:ind w:left="372" w:right="120" w:hanging="252"/>
-            </w:pPr>
-            <w:r>
-              <w:rPr>
-                <w:rFonts w:ascii="Arial" w:hAnsi="Arial" w:cs="Arial"/>
-                <w:sz w:val="21"/>
-                <w:szCs w:val="21"/>
-              </w:rPr>
-              <w:t xml:space="preserve">Notificaciones dentro de la plataforma (HU-13).</w:t>
-            </w:r>
-          </w:p>
-          <w:p>
-            <w:pPr>
-              <w:pStyle w:val="TableParagraph"/>
-              <w:numPr>
-                <w:ilvl w:val="0"/>
-                <w:numId w:val="1"/>
-              </w:numPr>
-              <w:spacing w:before="20" w:after="20" w:line="252" w:lineRule="auto"/>
-              <w:ind w:left="372" w:right="120" w:hanging="252"/>
-            </w:pPr>
-            <w:r>
-              <w:rPr>
-                <w:rFonts w:ascii="Arial" w:hAnsi="Arial" w:cs="Arial"/>
-                <w:sz w:val="21"/>
-                <w:szCs w:val="21"/>
-              </w:rPr>
-              <w:t xml:space="preserve">Reseñas y calificaciones después de una estancia completada, con moderación (HU-14, HU-15).</w:t>
-            </w:r>
-          </w:p>
-          <w:p>
-            <w:pPr>
-              <w:pStyle w:val="TableParagraph"/>
-              <w:numPr>
-                <w:ilvl w:val="0"/>
-                <w:numId w:val="1"/>
-              </w:numPr>
-              <w:spacing w:before="20" w:after="20" w:line="252" w:lineRule="auto"/>
-              <w:ind w:left="372" w:right="120" w:hanging="252"/>
-            </w:pPr>
-            <w:r>
-              <w:rPr>
-                <w:rFonts w:ascii="Arial" w:hAnsi="Arial" w:cs="Arial"/>
-                <w:sz w:val="21"/>
-                <w:szCs w:val="21"/>
-              </w:rPr>
-              <w:t xml:space="preserve">Administración: bloquear publicaciones, restringir usuarios y consultar eventos de auditoría (HU-16).</w:t>
-            </w:r>
-          </w:p>
-          <w:p>
-            <w:pPr>
-              <w:pStyle w:val="TableParagraph"/>
-              <w:numPr>
-                <w:ilvl w:val="0"/>
-                <w:numId w:val="1"/>
-              </w:numPr>
-              <w:spacing w:before="20" w:after="20" w:line="252" w:lineRule="auto"/>
-              <w:ind w:left="372" w:right="120" w:hanging="252"/>
-            </w:pPr>
-            <w:r>
-              <w:rPr>
-                <w:rFonts w:ascii="Arial" w:hAnsi="Arial" w:cs="Arial"/>
-                <w:sz w:val="21"/>
-                <w:szCs w:val="21"/>
-              </w:rPr>
-              <w:t xml:space="preserve">Dashboard con usuarios, publicaciones activas, reservas por estado, ingresos estimados y ciudades con mayor demanda (HU-17).</w:t>
-            </w:r>
-          </w:p>
-          <w:p>
-            <w:pPr>
-              <w:pStyle w:val="TableParagraph"/>
-              <w:numPr>
-                <w:ilvl w:val="0"/>
-                <w:numId w:val="1"/>
-              </w:numPr>
-              <w:spacing w:before="20" w:after="20" w:line="252" w:lineRule="auto"/>
-              <w:ind w:left="372" w:right="120" w:hanging="252"/>
-            </w:pPr>
-            <w:r>
-              <w:rPr>
-                <w:rFonts w:ascii="Arial" w:hAnsi="Arial" w:cs="Arial"/>
-                <w:sz w:val="21"/>
-                <w:szCs w:val="21"/>
-              </w:rPr>
-              <w:t xml:space="preserve">Exportar reportes de gestión a PDF o Excel (HU-18).</w:t>
-            </w:r>
-          </w:p>
-          <w:p>
-            <w:pPr>
-              <w:pStyle w:val="TableParagraph"/>
-              <w:numPr>
-                <w:ilvl w:val="0"/>
-                <w:numId w:val="1"/>
-              </w:numPr>
-              <w:spacing w:before="20" w:after="20" w:line="252" w:lineRule="auto"/>
-              <w:ind w:left="372" w:right="120" w:hanging="252"/>
-            </w:pPr>
-            <w:r>
-              <w:rPr>
-                <w:rFonts w:ascii="Arial" w:hAnsi="Arial" w:cs="Arial"/>
-                <w:sz w:val="21"/>
-                <w:szCs w:val="21"/>
-              </w:rPr>
-              <w:t xml:space="preserve">Logs estructurados de autenticación, publicación, reserva, cancelación, reseñas, errores y acciones administrativas (HU-19).</w:t>
-            </w:r>
-          </w:p>
-          <w:p>
-            <w:pPr>
-              <w:pStyle w:val="TableParagraph"/>
-              <w:numPr>
-                <w:ilvl w:val="0"/>
-                <w:numId w:val="1"/>
-              </w:numPr>
-              <w:spacing w:before="20" w:after="20" w:line="252" w:lineRule="auto"/>
-              <w:ind w:left="372" w:right="120" w:hanging="252"/>
-            </w:pPr>
-            <w:r>
-              <w:rPr>
-                <w:rFonts w:ascii="Arial" w:hAnsi="Arial" w:cs="Arial"/>
-                <w:sz w:val="21"/>
-                <w:szCs w:val="21"/>
-              </w:rPr>
-              <w:t xml:space="preserve">Pagos simulados con Stripe en modo de pruebas (no son pagos reales).</w:t>
+              <w:t>WON'T — procesar pagos reales o usar credenciales de producción; los pagos del MVP se simulan con Stripe en modo de pruebas.</w:t>
             </w:r>
           </w:p>
         </w:tc>
@@ -2931,6 +2753,11 @@
                 <w:szCs w:val="21"/>
               </w:rPr>
               <w:t xml:space="preserve">Presentar las dos entregas por el aula virtual y hacer la sustentación con todos los integrantes.</w:t>
+            </w:r>
+          </w:p>
+          <w:p>
+            <w:r>
+              <w:t>Levantamiento documentado: análisis de la guía oficial del proyecto y contraste con visión, requerimientos, historias, casos de uso y pruebas del repositorio. No hay entrevistas, talleres ni aprobación de Inversiones LR registradas; quedan pendientes de validación.</w:t>
             </w:r>
           </w:p>
         </w:tc>
@@ -3265,18 +3092,8 @@
             <w:tcW w:w="3150" w:type="dxa"/>
           </w:tcPr>
           <w:p>
-            <w:pPr>
-              <w:pStyle w:val="TableParagraph"/>
-              <w:spacing w:before="30" w:after="30" w:line="252" w:lineRule="auto"/>
-              <w:ind w:left="108" w:right="108"/>
-            </w:pPr>
-            <w:r>
-              <w:rPr>
-                <w:rFonts w:ascii="Arial" w:hAnsi="Arial" w:cs="Arial"/>
-                <w:sz w:val="20"/>
-                <w:szCs w:val="20"/>
-              </w:rPr>
-              <w:t xml:space="preserve">Historias con formato "Como..., quiero..., para...", criterios Dado que / Cuando / Entonces e identificador para la trazabilidad</w:t>
+            <w:r>
+              <w:t>El sistema debe contar con un catálogo trazable de requerimientos priorizados y con criterios que empiezan con «El sistema debe» y conservan Dado/Cuando/Entonces.</w:t>
             </w:r>
           </w:p>
         </w:tc>
@@ -3322,18 +3139,8 @@
             <w:tcW w:w="3150" w:type="dxa"/>
           </w:tcPr>
           <w:p>
-            <w:pPr>
-              <w:pStyle w:val="TableParagraph"/>
-              <w:spacing w:before="30" w:after="30" w:line="252" w:lineRule="auto"/>
-              <w:ind w:left="108" w:right="108"/>
-            </w:pPr>
-            <w:r>
-              <w:rPr>
-                <w:rFonts w:ascii="Arial" w:hAnsi="Arial" w:cs="Arial"/>
-                <w:sz w:val="20"/>
-                <w:szCs w:val="20"/>
-              </w:rPr>
-              <w:t xml:space="preserve">Diagramas en UML, C4 o BPMN coherentes con los requerimientos; cada servicio relacionado con las historias que atiende</w:t>
+            <w:r>
+              <w:t>El sistema debe tener diagramas coherentes con los requerimientos priorizados y servicios relacionados con las historias que atienden.</w:t>
             </w:r>
           </w:p>
         </w:tc>
@@ -3379,18 +3186,8 @@
             <w:tcW w:w="3150" w:type="dxa"/>
           </w:tcPr>
           <w:p>
-            <w:pPr>
-              <w:pStyle w:val="TableParagraph"/>
-              <w:spacing w:before="30" w:after="30" w:line="252" w:lineRule="auto"/>
-              <w:ind w:left="108" w:right="108"/>
-            </w:pPr>
-            <w:r>
-              <w:rPr>
-                <w:rFonts w:ascii="Arial" w:hAnsi="Arial" w:cs="Arial"/>
-                <w:sz w:val="20"/>
-                <w:szCs w:val="20"/>
-              </w:rPr>
-              <w:t>Integrado por Pull Request con revisión de otro integrante. El Quality Gate de SonarCloud se verificará cuando el servicio esté configurado.</w:t>
+            <w:r>
+              <w:t>El sistema debe integrarse mediante Pull Request revisado; el Quality Gate de SonarCloud se verificará cuando el servicio esté configurado.</w:t>
             </w:r>
           </w:p>
         </w:tc>
@@ -3436,18 +3233,8 @@
             <w:tcW w:w="3150" w:type="dxa"/>
           </w:tcPr>
           <w:p>
-            <w:pPr>
-              <w:pStyle w:val="TableParagraph"/>
-              <w:spacing w:before="30" w:after="30" w:line="252" w:lineRule="auto"/>
-              <w:ind w:left="108" w:right="108"/>
-            </w:pPr>
-            <w:r>
-              <w:rPr>
-                <w:rFonts w:ascii="Arial" w:hAnsi="Arial" w:cs="Arial"/>
-                <w:sz w:val="20"/>
-                <w:szCs w:val="20"/>
-              </w:rPr>
-              <w:t xml:space="preserve">Pruebas ejecutadas en GitHub Actions y demostración del flujo completo: publicación, búsqueda, disponibilidad, cotización y reserva inmediata</w:t>
+            <w:r>
+              <w:t>El sistema debe superar las pruebas ejecutadas en GitHub Actions y demostrar el flujo MUST de publicación, búsqueda, disponibilidad, cotización y reserva inmediata.</w:t>
             </w:r>
           </w:p>
         </w:tc>

</xml_diff>